<commit_message>
Rebuild 60W checklist from the new troubleshooting_doc.py template
Adds the YAML spec as the source of truth (MD/27R_60W_Draw_Isolation_Checklist.yaml)
and regenerates the .md/.docx/.pdf from it via scripts/troubleshooting_doc.py,
so this guide follows the same repeatable format as future troubleshooting
guides. Content is unchanged; only the generation path and a minor markdown
escaping fix (no more raw HTML leaking into the .md/.docx) changed.
</commit_message>
<xml_diff>
--- a/27R/27R_60W_Draw_Isolation_Checklist.docx
+++ b/27R/27R_60W_Draw_Isolation_Checklist.docx
@@ -7,36 +7,20 @@
         <w:pStyle w:val="Title"/>
       </w:pPr>
       <w:r>
-        <w:t>27R - Isolating a Continuous 60W Parasitic Draw</w:t>
+        <w:t>Isolating a Continuous 60W Parasitic Draw</w:t>
       </w:r>
     </w:p>
     <w:p>
       <w:r>
         <w:rPr>
-          <w:b/>
-        </w:rPr>
-        <w:t>Starting assumption:</w:t>
-      </w:r>
-      <w:r>
-        <w:t xml:space="preserve"> every power switch you know of is already in the OFF position. This checklist first </w:t>
-      </w:r>
-      <w:r>
-        <w:rPr>
           <w:i/>
         </w:rPr>
-        <w:t>confirms</w:t>
+        <w:t>Generated from `27R_60W_Draw_Isolation_Checklist.yaml` via `troubleshooting_doc.py` — edit that file, not this one.</w:t>
       </w:r>
+    </w:p>
+    <w:p>
       <w:r>
-        <w:t xml:space="preserve"> that's actually true (several of these have a physical switch </w:t>
-      </w:r>
-      <w:r>
-        <w:rPr>
-          <w:b/>
-        </w:rPr>
-        <w:t>and</w:t>
-      </w:r>
-      <w:r>
-        <w:t xml:space="preserve"> a separate software toggle that can disagree with each other — that mismatch is the most likely cause of the draw), then walks through reading the true baseline and isolating further if the draw remains.</w:t>
+        <w:t>Start with every switch believed OFF. This checklist confirms that's actually true, then reads the true baseline and isolates further if the draw remains.</w:t>
       </w:r>
     </w:p>
     <w:p>
@@ -47,7 +31,21 @@
         <w:t>What you need:</w:t>
       </w:r>
       <w:r>
-        <w:t xml:space="preserve"> access to the WinConnect touchscreen (Energy Management screen), and physical access to the passenger-side compartment, water heater exterior access panel, and entry/galley area.</w:t>
+        <w:t xml:space="preserve"> WinConnect touchscreen (Energy Management screen), passenger-side compartment access, water heater exterior access panel, entry/galley walk-through.</w:t>
+      </w:r>
+    </w:p>
+    <w:p>
+      <w:r>
+        <w:t xml:space="preserve">*Several items below have a physical switch </w:t>
+      </w:r>
+      <w:r>
+        <w:rPr>
+          <w:b/>
+        </w:rPr>
+        <w:t>and</w:t>
+      </w:r>
+      <w:r>
+        <w:t xml:space="preserve"> a separate software toggle that can disagree with each other — that mismatch is the most common cause of an unexplained draw.*</w:t>
       </w:r>
     </w:p>
     <w:p>
@@ -60,25 +58,7 @@
     </w:p>
     <w:p>
       <w:r>
-        <w:t xml:space="preserve">Go through these in order. For each, the check has two parts where applicable: the </w:t>
-      </w:r>
-      <w:r>
-        <w:rPr>
-          <w:b/>
-        </w:rPr>
-        <w:t>physical switch position</w:t>
-      </w:r>
-      <w:r>
-        <w:t xml:space="preserve"> and the </w:t>
-      </w:r>
-      <w:r>
-        <w:rPr>
-          <w:b/>
-        </w:rPr>
-        <w:t>WinConnect confirmation</w:t>
-      </w:r>
-      <w:r>
-        <w:t xml:space="preserve"> — don't skip the second part, since a switch can be flipped off while the device behind it is still electrically live if there's a second, separate control.</w:t>
+        <w:t>Work through in order — each item lists both the physical check and the software confirmation.</w:t>
       </w:r>
     </w:p>
     <w:p>
@@ -94,7 +74,7 @@
         <w:pStyle w:val="ListBullet"/>
       </w:pPr>
       <w:r>
-        <w:t>Unplug the shoreline power cord completely from the outside receptacle; coil it back into its compartment (driver's side).</w:t>
+        <w:t>Shoreline power cord fully unplugged and coiled back into its compartment (driver's side).</w:t>
       </w:r>
     </w:p>
     <w:p>
@@ -102,7 +82,26 @@
         <w:pStyle w:val="ListBullet"/>
       </w:pPr>
       <w:r>
-        <w:t>Confirm the generator is not running (WinConnect → generator screen should show it off; also listen/check for exhaust).</w:t>
+        <w:t>Generator confirmed OFF (WinConnect generator screen, plus listen/check for exhaust).</w:t>
+      </w:r>
+    </w:p>
+    <w:p>
+      <w:r>
+        <w:rPr>
+          <w:i/>
+        </w:rPr>
+        <w:t>Why this matters:</w:t>
+      </w:r>
+      <w:r>
+        <w:t xml:space="preserve"> If shore power or the generator is live, you're not reading a true battery drain.</w:t>
+      </w:r>
+    </w:p>
+    <w:p>
+      <w:pPr>
+        <w:pStyle w:val="Heading3"/>
+      </w:pPr>
+      <w:r>
+        <w:t>☐ 2. Inverter/charger disconnect switch — TOP SUSPECT</w:t>
       </w:r>
     </w:p>
     <w:p>
@@ -110,21 +109,7 @@
         <w:pStyle w:val="ListBullet"/>
       </w:pPr>
       <w:r>
-        <w:rPr>
-          <w:b/>
-        </w:rPr>
-        <w:t>Why first:</w:t>
-      </w:r>
-      <w:r>
-        <w:t xml:space="preserve"> if shore power or the generator is live, you're not reading a true battery drain — you're reading something else. This has to be off before anything else is meaningful.</w:t>
-      </w:r>
-    </w:p>
-    <w:p>
-      <w:pPr>
-        <w:pStyle w:val="Heading3"/>
-      </w:pPr>
-      <w:r>
-        <w:t>☐ 2. Inverter/charger disconnect switch — the top suspect</w:t>
+        <w:t>Physical switch (passenger-side compartment, near the inverter/charger unit) is OFF.</w:t>
       </w:r>
     </w:p>
     <w:p>
@@ -132,64 +117,18 @@
         <w:pStyle w:val="ListBullet"/>
       </w:pPr>
       <w:r>
-        <w:t xml:space="preserve">Physical switch location: </w:t>
-      </w:r>
-      <w:r>
-        <w:rPr>
-          <w:b/>
-        </w:rPr>
-        <w:t>passenger-side compartment</w:t>
-      </w:r>
-      <w:r>
-        <w:t>, near the inverter/charger unit itself (behind the mid or front passenger-side compartment door, depending on option package).</w:t>
+        <w:t>WinConnect → Energy Management screen also shows the inverter OFF (not just “on but inactive”).</w:t>
       </w:r>
     </w:p>
     <w:p>
-      <w:pPr>
-        <w:pStyle w:val="ListBullet"/>
-      </w:pPr>
-      <w:r>
-        <w:t>Confirm the physical switch is in the OFF position.</w:t>
-      </w:r>
-    </w:p>
-    <w:p>
-      <w:pPr>
-        <w:pStyle w:val="ListBullet"/>
-      </w:pPr>
-      <w:r>
-        <w:t xml:space="preserve">Separately, open WinConnect → </w:t>
-      </w:r>
       <w:r>
         <w:rPr>
-          <w:b/>
-        </w:rPr>
-        <w:t>Energy Management</w:t>
-      </w:r>
-      <w:r>
-        <w:t xml:space="preserve"> screen and confirm the inverter is shown OFF there too (not just "on but inactive").</w:t>
-      </w:r>
-    </w:p>
-    <w:p>
-      <w:pPr>
-        <w:pStyle w:val="ListBullet"/>
-      </w:pPr>
-      <w:r>
-        <w:rPr>
-          <w:b/>
+          <w:i/>
         </w:rPr>
         <w:t>Why this matters:</w:t>
       </w:r>
       <w:r>
-        <w:t xml:space="preserve"> the inverter has its own on/off control in the touchscreen software </w:t>
-      </w:r>
-      <w:r>
-        <w:rPr>
-          <w:i/>
-        </w:rPr>
-        <w:t>and</w:t>
-      </w:r>
-      <w:r>
-        <w:t xml:space="preserve"> a separate physical disconnect switch. Turning it off in the app does not guarantee the physical switch is off, and vice versa. If the physical switch is on while the app shows "off," the inverter's internal standby electronics can still draw continuous power — a very plausible single source of ~60W by itself.</w:t>
+        <w:t xml:space="preserve"> This switch is separate from the software toggle. Left on while the app shows “off,” the inverter's standby electronics can keep drawing power — plausibly the full 60W by itself.</w:t>
       </w:r>
     </w:p>
     <w:p>
@@ -205,16 +144,7 @@
         <w:pStyle w:val="ListBullet"/>
       </w:pPr>
       <w:r>
-        <w:t xml:space="preserve">Physical switch: </w:t>
-      </w:r>
-      <w:r>
-        <w:rPr>
-          <w:b/>
-        </w:rPr>
-        <w:t>behind the water heater access panel on the exterior</w:t>
-      </w:r>
-      <w:r>
-        <w:t xml:space="preserve"> of the motorhome. Confirm it's pressed to OFF (both "on" positions on this switch do the same thing — either up or down can mean on, depending on the unit — check for the green indicator light, which should be OFF).</w:t>
+        <w:t>Physical switch behind the exterior access panel is OFF (green indicator light off).</w:t>
       </w:r>
     </w:p>
     <w:p>
@@ -222,7 +152,7 @@
         <w:pStyle w:val="ListBullet"/>
       </w:pPr>
       <w:r>
-        <w:t>Also confirm via WinConnect → Water Systems screen that the water heater shows off, not just set to Economy mode (Economy still runs the recirculation pump periodically; that's a real continuous-ish draw and not what we want for a clean baseline).</w:t>
+        <w:t>WinConnect → Water Systems screen confirms OFF — not just Economy mode (which still cycles the recirculation pump).</w:t>
       </w:r>
     </w:p>
     <w:p>
@@ -238,16 +168,18 @@
         <w:pStyle w:val="ListBullet"/>
       </w:pPr>
       <w:r>
-        <w:t xml:space="preserve">WinConnect → </w:t>
+        <w:t>WinConnect → Water Systems screen — pad toggle(s) confirmed off.</w:t>
+      </w:r>
+    </w:p>
+    <w:p>
+      <w:r>
+        <w:rPr>
+          <w:i/>
+        </w:rPr>
+        <w:t>Why this matters:</w:t>
       </w:r>
       <w:r>
-        <w:rPr>
-          <w:b/>
-        </w:rPr>
-        <w:t>Water Systems screen</w:t>
-      </w:r>
-      <w:r>
-        <w:t xml:space="preserve"> — confirm the tank heating pad toggle(s) are off. These are thermostatically controlled and can silently re-engage in cold weather even if you don't remember turning them on, so check them explicitly rather than assuming.</w:t>
+        <w:t xml:space="preserve"> Thermostatically controlled — can silently re-engage in cold weather.</w:t>
       </w:r>
     </w:p>
     <w:p>
@@ -263,16 +195,7 @@
         <w:pStyle w:val="ListBullet"/>
       </w:pPr>
       <w:r>
-        <w:t xml:space="preserve">Confirm the refrigerator control panel/thermostat is switched off (not just turned down to setting "1"). This is a </w:t>
-      </w:r>
-      <w:r>
-        <w:rPr>
-          <w:b/>
-        </w:rPr>
-        <w:t>12V DC compressor refrigerator</w:t>
-      </w:r>
-      <w:r>
-        <w:t xml:space="preserve"> — it draws directly off the house battery, and "1" is still a running setting, not off.</w:t>
+        <w:t>Control panel/thermostat fully OFF (not just turned down to “1” — that's still running).</w:t>
       </w:r>
     </w:p>
     <w:p>
@@ -280,7 +203,18 @@
         <w:pStyle w:val="ListBullet"/>
       </w:pPr>
       <w:r>
-        <w:t>If WinConnect's Home screen shows a refrigerator status, confirm it agrees.</w:t>
+        <w:t>WinConnect Home screen (if it shows fridge status) agrees.</w:t>
+      </w:r>
+    </w:p>
+    <w:p>
+      <w:r>
+        <w:rPr>
+          <w:i/>
+        </w:rPr>
+        <w:t>Why this matters:</w:t>
+      </w:r>
+      <w:r>
+        <w:t xml:space="preserve"> This is a 12V DC compressor refrigerator — draws directly off the house battery.</w:t>
       </w:r>
     </w:p>
     <w:p>
@@ -296,21 +230,18 @@
         <w:pStyle w:val="ListBullet"/>
       </w:pPr>
       <w:r>
-        <w:t>This has its own dedicated power switch per the coach wiring (separate from general interior light switches — easy to forget as part of "everything"). Confirm it's off.</w:t>
+        <w:t>Dedicated power switch (separate from interior light switches) confirmed off.</w:t>
       </w:r>
     </w:p>
     <w:p>
-      <w:pPr>
-        <w:pStyle w:val="ListBullet"/>
-      </w:pPr>
       <w:r>
         <w:rPr>
           <w:i/>
         </w:rPr>
-        <w:t>Note:</w:t>
+        <w:t>Why this matters:</w:t>
       </w:r>
       <w:r>
-        <w:t xml:space="preserve"> the operator's manual doesn't give an exact physical location for this switch — check near the Winegard antenna control panel (commonly near the entry door or overhead near the dash). If you can't find it, flag that and we can dig into the wiring diagrams further.</w:t>
+        <w:t xml:space="preserve"> Exact location isn't specified in the manual — check near the Winegard antenna control panel.</w:t>
       </w:r>
     </w:p>
     <w:p>
@@ -326,7 +257,7 @@
         <w:pStyle w:val="ListBullet"/>
       </w:pPr>
       <w:r>
-        <w:t>Walk the length of the coach and confirm no interior lights, reading lamps, or accent lighting are lit.</w:t>
+        <w:t>Walked the length of the coach — no interior/reading/accent lights lit.</w:t>
       </w:r>
     </w:p>
     <w:p>
@@ -334,7 +265,7 @@
         <w:pStyle w:val="ListBullet"/>
       </w:pPr>
       <w:r>
-        <w:t>Unplug any USB devices actively charging from 12V USB outlets (phone chargers, etc.) — small individually, but worth ruling out.</w:t>
+        <w:t>Any actively-charging USB devices unplugged from 12V USB outlets.</w:t>
       </w:r>
     </w:p>
     <w:p>
@@ -342,36 +273,21 @@
         <w:pStyle w:val="Heading3"/>
       </w:pPr>
       <w:r>
-        <w:t>☐ 8. Things that legitimately cannot be turned off (expect these, don't chase them)</w:t>
+        <w:t>Expected residual load — don't chase these</w:t>
       </w:r>
     </w:p>
     <w:p>
-      <w:pPr>
-        <w:pStyle w:val="ListBullet"/>
-      </w:pPr>
       <w:r>
         <w:rPr>
           <w:b/>
         </w:rPr>
-        <w:t>Propane gas leak detector</w:t>
+        <w:t>Propane gas leak detector &amp; CO detector</w:t>
       </w:r>
       <w:r>
-        <w:t xml:space="preserve"> and </w:t>
-      </w:r>
-      <w:r>
-        <w:rPr>
-          <w:b/>
-        </w:rPr>
-        <w:t>CO detector</w:t>
-      </w:r>
-      <w:r>
-        <w:t xml:space="preserve"> — always powered from the house battery by design. Manual explicitly notes these draw "a small amount of current" continuously. This should be well under 1–2W combined, not a meaningful contributor to 60W.</w:t>
+        <w:t xml:space="preserve"> — always powered by design; should be well under 1–2W combined.</w:t>
       </w:r>
     </w:p>
     <w:p>
-      <w:pPr>
-        <w:pStyle w:val="ListBullet"/>
-      </w:pPr>
       <w:r>
         <w:rPr>
           <w:b/>
@@ -379,7 +295,7 @@
         <w:t>CZone/RV-C control modules</w:t>
       </w:r>
       <w:r>
-        <w:t xml:space="preserve"> (main switching module, coach management module, Truma interface, lighting controller, solar charge controller) — these stay powered whenever the master coach battery switch is on, so they can listen for commands from the touchscreen and physical switches. Normal combined standby draw for these should be low single-digit watts.</w:t>
+        <w:t xml:space="preserve"> (main switching module, coach management, Truma interface, lighting controller, solar charge controller) — stay powered whenever the master battery switch is on. Normal combined standby should be low single-digit watts.</w:t>
       </w:r>
     </w:p>
     <w:p>
@@ -392,26 +308,29 @@
     </w:p>
     <w:p>
       <w:r>
-        <w:t>With every item in Part 1 confirmed off (master House/Coach Battery Disconnect switch still ON — you need this on to read anything):</w:t>
+        <w:t>With every Part 1 item confirmed off (master House/Coach Battery Disconnect switch still ON — you need this to read anything):</w:t>
       </w:r>
     </w:p>
     <w:p>
       <w:r>
-        <w:t xml:space="preserve">1. Open WinConnect → </w:t>
+        <w:rPr>
+          <w:b/>
+        </w:rPr>
+        <w:t>1.</w:t>
       </w:r>
+      <w:r>
+        <w:t xml:space="preserve"> Open WinConnect → Energy Management screen.</w:t>
+      </w:r>
+    </w:p>
+    <w:p>
       <w:r>
         <w:rPr>
           <w:b/>
         </w:rPr>
-        <w:t>Energy Management</w:t>
+        <w:t>2.</w:t>
       </w:r>
       <w:r>
-        <w:t xml:space="preserve"> screen.</w:t>
-      </w:r>
-    </w:p>
-    <w:p>
-      <w:r>
-        <w:t xml:space="preserve">2. Read the </w:t>
+        <w:t xml:space="preserve"> Read the </w:t>
       </w:r>
       <w:r>
         <w:rPr>
@@ -420,45 +339,86 @@
         <w:t>Usage</w:t>
       </w:r>
       <w:r>
-        <w:t xml:space="preserve"> value. This is your true "everything off" baseline.</w:t>
+        <w:t xml:space="preserve"> value — this is your true “everything off” baseline.</w:t>
       </w:r>
     </w:p>
-    <w:p>
-      <w:r>
-        <w:rPr>
-          <w:b/>
-        </w:rPr>
-        <w:t>Interpreting the result:</w:t>
-      </w:r>
-    </w:p>
-    <w:p>
-      <w:pPr>
-        <w:pStyle w:val="ListBullet"/>
-      </w:pPr>
-      <w:r>
-        <w:rPr>
-          <w:b/>
-        </w:rPr>
-        <w:t>Near 0W:</w:t>
-      </w:r>
-      <w:r>
-        <w:t xml:space="preserve"> you found it — whichever item in Part 1 you discovered was actually still on (most likely the inverter disconnect switch mismatch) was the cause. Leave it off going forward, or note it as something to check each time before storage.</w:t>
-      </w:r>
-    </w:p>
-    <w:p>
-      <w:pPr>
-        <w:pStyle w:val="ListBullet"/>
-      </w:pPr>
-      <w:r>
-        <w:rPr>
-          <w:b/>
-        </w:rPr>
-        <w:t>Still showing ~60W:</w:t>
-      </w:r>
-      <w:r>
-        <w:t xml:space="preserve"> the draw is coming from something not covered by a normal user-facing switch — proceed to Part 3.</w:t>
-      </w:r>
-    </w:p>
+    <w:tbl>
+      <w:tblPr>
+        <w:tblStyle w:val="LightGrid-Accent1"/>
+        <w:tblW w:type="auto" w:w="0"/>
+        <w:tblLook w:firstColumn="1" w:firstRow="1" w:lastColumn="0" w:lastRow="0" w:noHBand="0" w:noVBand="1" w:val="04A0"/>
+      </w:tblPr>
+      <w:tblGrid>
+        <w:gridCol w:w="5400"/>
+        <w:gridCol w:w="5400"/>
+      </w:tblGrid>
+      <w:tr>
+        <w:tc>
+          <w:tcPr>
+            <w:tcW w:type="dxa" w:w="5400"/>
+          </w:tcPr>
+          <w:p>
+            <w:r>
+              <w:t>Reading</w:t>
+            </w:r>
+          </w:p>
+        </w:tc>
+        <w:tc>
+          <w:tcPr>
+            <w:tcW w:type="dxa" w:w="5400"/>
+          </w:tcPr>
+          <w:p>
+            <w:r>
+              <w:t>What it means</w:t>
+            </w:r>
+          </w:p>
+        </w:tc>
+      </w:tr>
+      <w:tr>
+        <w:tc>
+          <w:tcPr>
+            <w:tcW w:type="dxa" w:w="5400"/>
+          </w:tcPr>
+          <w:p>
+            <w:r>
+              <w:t>Near 0W</w:t>
+            </w:r>
+          </w:p>
+        </w:tc>
+        <w:tc>
+          <w:tcPr>
+            <w:tcW w:type="dxa" w:w="5400"/>
+          </w:tcPr>
+          <w:p>
+            <w:r>
+              <w:t>Found it — whichever item in Part 1 was actually still live (most likely the inverter disconnect switch mismatch) was the cause.</w:t>
+            </w:r>
+          </w:p>
+        </w:tc>
+      </w:tr>
+      <w:tr>
+        <w:tc>
+          <w:tcPr>
+            <w:tcW w:type="dxa" w:w="5400"/>
+          </w:tcPr>
+          <w:p>
+            <w:r>
+              <w:t>Still ~60W</w:t>
+            </w:r>
+          </w:p>
+        </w:tc>
+        <w:tc>
+          <w:tcPr>
+            <w:tcW w:type="dxa" w:w="5400"/>
+          </w:tcPr>
+          <w:p>
+            <w:r>
+              <w:t>The draw is coming from something not covered by a normal user-facing switch — continue to Part 3.</w:t>
+            </w:r>
+          </w:p>
+        </w:tc>
+      </w:tr>
+    </w:tbl>
     <w:p>
       <w:pPr>
         <w:pStyle w:val="Heading2"/>
@@ -469,21 +429,24 @@
     </w:p>
     <w:p>
       <w:r>
-        <w:t>1. Re-confirm each item in Part 1 one more time — it's easy to miss one, and the inverter disconnect switch in particular is worth double-checking since it's the most likely culprit.</w:t>
+        <w:rPr>
+          <w:b/>
+        </w:rPr>
+        <w:t>1.</w:t>
+      </w:r>
+      <w:r>
+        <w:t xml:space="preserve"> Re-confirm each Part 1 item once more — double-check the inverter disconnect switch especially.</w:t>
       </w:r>
     </w:p>
     <w:p>
       <w:r>
-        <w:t xml:space="preserve">2. Check the </w:t>
-      </w:r>
-      <w:r>
         <w:rPr>
           <w:b/>
         </w:rPr>
-        <w:t>Coach 12V Panel</w:t>
+        <w:t>2.</w:t>
       </w:r>
       <w:r>
-        <w:t xml:space="preserve"> (passenger-side compartment, under/near the passenger seat) for any breaker or fuse that looks tripped, warm, or otherwise abnormal. Note: most of this panel is main supply protection (Coach Batt Fuse, Chassis Batt Fuse, slideout breaker, etc.) rather than individual branch circuits — do </w:t>
+        <w:t xml:space="preserve"> Inspect the Coach 12V Panel (passenger-side compartment) for any breaker/fuse that looks tripped, warm, or abnormal. Do </w:t>
       </w:r>
       <w:r>
         <w:rPr>
@@ -492,33 +455,29 @@
         <w:t>not</w:t>
       </w:r>
       <w:r>
-        <w:t xml:space="preserve"> pull the Coach Batt Fuse or Chassis Batt Fuse to "test," as that removes power to everything, including the monitor you're trying to read.</w:t>
+        <w:t xml:space="preserve"> pull the Coach Batt Fuse or Chassis Batt Fuse to “test” — that kills power to the monitor you're trying to read.</w:t>
       </w:r>
     </w:p>
     <w:p>
       <w:r>
-        <w:t>3. If nothing so far explains it, this points toward either:</w:t>
+        <w:rPr>
+          <w:b/>
+        </w:rPr>
+        <w:t>3.</w:t>
       </w:r>
-    </w:p>
-    <w:p>
-      <w:pPr>
-        <w:pStyle w:val="ListBullet"/>
-      </w:pPr>
       <w:r>
-        <w:t>A fault in one of the CZone/RV-C modules (e.g., a relay stuck closed, keeping something energized that should be off), or</w:t>
-      </w:r>
-    </w:p>
-    <w:p>
-      <w:pPr>
-        <w:pStyle w:val="ListBullet"/>
-      </w:pPr>
-      <w:r>
-        <w:t>A wiring short or chafe point somewhere in the coach harness.</w:t>
+        <w:t xml:space="preserve"> If nothing explains it: likely a stuck relay in a CZone/RV-C module, or a wiring short/chafe point.</w:t>
       </w:r>
     </w:p>
     <w:p>
       <w:r>
-        <w:t>4. At this point, use the Wire Identification Chart (../Wiring_Diagrams/Wire_Identification_Chart.pdf) and wiring diagrams (../Wiring_Diagrams/README.md) to trace individual circuit codes with a multimeter/clamp meter, or contact a dealer/mobile RV electrician — a persistent draw that survives every user-accessible off switch usually means a component-level fault rather than something you can toggle away.</w:t>
+        <w:rPr>
+          <w:b/>
+        </w:rPr>
+        <w:t>4.</w:t>
+      </w:r>
+      <w:r>
+        <w:t xml:space="preserve"> Use the Wire Identification Chart and wiring diagrams to trace circuits with a multimeter/clamp meter, or contact a dealer/mobile RV electrician — a draw surviving every user-accessible off switch usually means a component-level fault.</w:t>
       </w:r>
     </w:p>
     <w:p>
@@ -526,7 +485,7 @@
         <w:rPr>
           <w:i/>
         </w:rPr>
-        <w:t>Companion documents: 27R_12V_Fuse_and_Breaker_Panel_Location.md (27R_12V_Fuse_and_Breaker_Panel_Location.md) (Coach 12V Panel contents and the CZone digital switching system), 27R_2000W_Inverter_Operation.md (27R_2000W_Inverter_Operation.md) (inverter operation and disconnect switch location).</w:t>
+        <w:t>Companion documents: 27R_12V_Fuse_and_Breaker_Panel_Location.md/.docx (Coach 12V Panel contents and the CZone digital switching system) | 27R_2000W_Inverter_Operation.md/.docx (inverter operation and disconnect switch location)</w:t>
       </w:r>
     </w:p>
     <w:sectPr>

</xml_diff>